<commit_message>
Se agrego una linea al archivo
</commit_message>
<xml_diff>
--- a/Archivo1.docx
+++ b/Archivo1.docx
@@ -7,7 +7,10 @@
         <w:pBdr/>
         <w:spacing/>
         <w:ind/>
-        <w:rPr/>
+        <w:rPr>
+          <w:highlight w:val="none"/>
+          <w:lang w:val="en-US"/>
+        </w:rPr>
       </w:pPr>
       <w:r>
         <w:rPr>
@@ -16,6 +19,33 @@
         <w:t xml:space="preserve">Este es mi primer repo</w:t>
       </w:r>
       <w:r/>
+    </w:p>
+    <w:p>
+      <w:pPr>
+        <w:pBdr/>
+        <w:spacing/>
+        <w:ind/>
+        <w:rPr/>
+      </w:pPr>
+      <w:r>
+        <w:rPr>
+          <w:highlight w:val="none"/>
+          <w:lang w:val="en-US"/>
+        </w:rPr>
+        <w:t xml:space="preserve">Primer cambio</w:t>
+      </w:r>
+      <w:r>
+        <w:rPr>
+          <w:highlight w:val="none"/>
+          <w:lang w:val="en-US"/>
+        </w:rPr>
+      </w:r>
+      <w:r>
+        <w:rPr>
+          <w:highlight w:val="none"/>
+          <w:lang w:val="en-US"/>
+        </w:rPr>
+      </w:r>
     </w:p>
     <w:sectPr>
       <w:footnotePr/>

</xml_diff>

<commit_message>
Se agregaron nuevos cambios a archivo
</commit_message>
<xml_diff>
--- a/Archivo1.docx
+++ b/Archivo1.docx
@@ -25,7 +25,10 @@
         <w:pBdr/>
         <w:spacing/>
         <w:ind/>
-        <w:rPr/>
+        <w:rPr>
+          <w:highlight w:val="none"/>
+          <w:lang w:val="en-US"/>
+        </w:rPr>
       </w:pPr>
       <w:r>
         <w:rPr>
@@ -33,6 +36,84 @@
           <w:lang w:val="en-US"/>
         </w:rPr>
         <w:t xml:space="preserve">Primer cambio</w:t>
+      </w:r>
+      <w:r>
+        <w:rPr>
+          <w:highlight w:val="none"/>
+          <w:lang w:val="en-US"/>
+        </w:rPr>
+      </w:r>
+      <w:r/>
+    </w:p>
+    <w:p>
+      <w:pPr>
+        <w:pBdr/>
+        <w:spacing/>
+        <w:ind/>
+        <w:rPr>
+          <w:highlight w:val="none"/>
+          <w:lang w:val="en-US"/>
+        </w:rPr>
+      </w:pPr>
+      <w:r>
+        <w:rPr>
+          <w:highlight w:val="none"/>
+          <w:lang w:val="en-US"/>
+        </w:rPr>
+        <w:t xml:space="preserve">Hola </w:t>
+      </w:r>
+      <w:r/>
+    </w:p>
+    <w:p>
+      <w:pPr>
+        <w:pBdr/>
+        <w:spacing/>
+        <w:ind/>
+        <w:rPr>
+          <w:highlight w:val="none"/>
+          <w:lang w:val="en-US"/>
+        </w:rPr>
+      </w:pPr>
+      <w:r>
+        <w:rPr>
+          <w:highlight w:val="none"/>
+          <w:lang w:val="en-US"/>
+        </w:rPr>
+        <w:t xml:space="preserve">Dsfdsfdsf</w:t>
+      </w:r>
+      <w:r/>
+    </w:p>
+    <w:p>
+      <w:pPr>
+        <w:pBdr/>
+        <w:spacing/>
+        <w:ind/>
+        <w:rPr>
+          <w:highlight w:val="none"/>
+          <w:lang w:val="en-US"/>
+        </w:rPr>
+      </w:pPr>
+      <w:r>
+        <w:rPr>
+          <w:highlight w:val="none"/>
+          <w:lang w:val="en-US"/>
+        </w:rPr>
+        <w:t xml:space="preserve">Dsfasfads</w:t>
+      </w:r>
+      <w:r/>
+    </w:p>
+    <w:p>
+      <w:pPr>
+        <w:pBdr/>
+        <w:spacing/>
+        <w:ind/>
+        <w:rPr/>
+      </w:pPr>
+      <w:r>
+        <w:rPr>
+          <w:highlight w:val="none"/>
+          <w:lang w:val="en-US"/>
+        </w:rPr>
       </w:r>
       <w:r>
         <w:rPr>

</xml_diff>

<commit_message>
Se Modifico el texto
</commit_message>
<xml_diff>
--- a/Archivo1.docx
+++ b/Archivo1.docx
@@ -27,6 +27,13 @@
           <w:bCs/>
           <w:highlight w:val="none"/>
           <w:lang w:val="en-US"/>
+        </w:rPr>
+      </w:r>
+      <w:r>
+        <w:rPr>
+          <w:b/>
+          <w:bCs/>
+          <w:highlight w:val="none"/>
         </w:rPr>
       </w:r>
     </w:p>
@@ -63,7 +70,6 @@
           <w:b/>
           <w:bCs/>
           <w:highlight w:val="none"/>
-          <w:lang w:val="en-US"/>
         </w:rPr>
       </w:r>
     </w:p>
@@ -95,16 +101,24 @@
           <w:lang w:val="en-US"/>
         </w:rPr>
       </w:r>
-    </w:p>
-    <w:p>
-      <w:pPr>
-        <w:pBdr/>
-        <w:spacing/>
-        <w:ind/>
+      <w:r>
         <w:rPr>
           <w:b/>
           <w:bCs/>
           <w:highlight w:val="none"/>
+        </w:rPr>
+      </w:r>
+    </w:p>
+    <w:p>
+      <w:pPr>
+        <w:pBdr/>
+        <w:spacing/>
+        <w:ind/>
+        <w:rPr>
+          <w:b/>
+          <w:bCs/>
+          <w:highlight w:val="none"/>
+          <w:lang w:val="en-US"/>
         </w:rPr>
       </w:pPr>
       <w:r>
@@ -121,7 +135,6 @@
           <w:b/>
           <w:bCs/>
           <w:highlight w:val="none"/>
-          <w:lang w:val="en-US"/>
         </w:rPr>
       </w:r>
     </w:p>
@@ -143,7 +156,7 @@
           <w:highlight w:val="none"/>
           <w:lang w:val="en-US"/>
         </w:rPr>
-        <w:t xml:space="preserve">Dsfasfads</w:t>
+        <w:t xml:space="preserve">Nueva PR</w:t>
       </w:r>
       <w:r>
         <w:rPr>
@@ -153,22 +166,6 @@
           <w:lang w:val="en-US"/>
         </w:rPr>
       </w:r>
-    </w:p>
-    <w:p>
-      <w:pPr>
-        <w:pBdr/>
-        <w:spacing/>
-        <w:ind/>
-        <w:rPr/>
-      </w:pPr>
-      <w:r>
-        <w:rPr>
-          <w:highlight w:val="none"/>
-          <w:lang w:val="en-US"/>
-        </w:rPr>
-        <w:t xml:space="preserve">Se agrego negrita</w:t>
-      </w:r>
-      <w:r/>
     </w:p>
     <w:sectPr>
       <w:footnotePr/>

</xml_diff>